<commit_message>
Use Sakkal Majalla as the primary font everywhere
The editing panel, the letter preview (digits included) and every run in
the generated Word file now use Sakkal Majalla; Calibri is no longer used.
The letterhead template's document defaults are set to Sakkal Majalla
14pt so text added later in Word keeps the same font.

Co-Authored-By: Claude Fable 5.1 <noreply@anthropic.com>
Claude-Session: https://claude.ai/code/session_01SkZdfh25ujZUktCGnktKFw
</commit_message>
<xml_diff>
--- a/assets/letter_template.docx
+++ b/assets/letter_template.docx
@@ -146,10 +146,10 @@
   <w:docDefaults>
     <w:rPrDefault>
       <w:rPr>
-        <w:rFonts w:asciiTheme="minorHAnsi" w:eastAsiaTheme="minorHAnsi" w:hAnsiTheme="minorHAnsi" w:cstheme="minorBidi"/>
+        <w:rFonts w:ascii="Sakkal Majalla" w:eastAsia="Sakkal Majalla" w:hAnsi="Sakkal Majalla" w:cs="Sakkal Majalla"/>
         <w:kern w:val="2"/>
-        <w:sz w:val="22"/>
-        <w:szCs w:val="22"/>
+        <w:sz w:val="28"/>
+        <w:szCs w:val="28"/>
         <w:lang w:val="en-US" w:eastAsia="en-US" w:bidi="ar-SA"/>
         <w14:ligatures w14:val="standardContextual"/>
       </w:rPr>

</xml_diff>